<commit_message>
Bo sung minh chung Google Docs that cho Ex1.2
</commit_message>
<xml_diff>
--- a/BaoCaoTinHocVanPhong.docx
+++ b/BaoCaoTinHocVanPhong.docx
@@ -1806,7 +1806,7 @@
       <w:r>
         <w:drawing>
           <wp:inline xmlns:a="http://schemas.openxmlformats.org/drawingml/2006/main" xmlns:pic="http://schemas.openxmlformats.org/drawingml/2006/picture">
-            <wp:extent cx="2951999" cy="4171749"/>
+            <wp:extent cx="2412000" cy="3408625"/>
             <wp:docPr id="12" name="Picture 12"/>
             <wp:cNvGraphicFramePr>
               <a:graphicFrameLocks noChangeAspect="1"/>
@@ -1827,7 +1827,7 @@
                   <pic:spPr>
                     <a:xfrm>
                       <a:off x="0" y="0"/>
-                      <a:ext cx="2951999" cy="4171749"/>
+                      <a:ext cx="2412000" cy="3408625"/>
                     </a:xfrm>
                     <a:prstGeom prst="rect"/>
                   </pic:spPr>
@@ -1872,8 +1872,47 @@
     </w:p>
     <w:p>
       <w:pPr>
-        <w:keepNext/>
-        <w:spacing w:before="100" w:after="40" w:line="288" w:lineRule="auto"/>
+        <w:spacing w:after="60"/>
+        <w:jc w:val="center"/>
+      </w:pPr>
+      <w:r>
+        <w:drawing>
+          <wp:inline xmlns:a="http://schemas.openxmlformats.org/drawingml/2006/main" xmlns:pic="http://schemas.openxmlformats.org/drawingml/2006/picture">
+            <wp:extent cx="1475999" cy="3199210"/>
+            <wp:docPr id="13" name="Picture 13"/>
+            <wp:cNvGraphicFramePr>
+              <a:graphicFrameLocks noChangeAspect="1"/>
+            </wp:cNvGraphicFramePr>
+            <a:graphic>
+              <a:graphicData uri="http://schemas.openxmlformats.org/drawingml/2006/picture">
+                <pic:pic>
+                  <pic:nvPicPr>
+                    <pic:cNvPr id="0" name="Lab05_Ex1.2.png"/>
+                    <pic:cNvPicPr/>
+                  </pic:nvPicPr>
+                  <pic:blipFill>
+                    <a:blip r:embed="rId20"/>
+                    <a:stretch>
+                      <a:fillRect/>
+                    </a:stretch>
+                  </pic:blipFill>
+                  <pic:spPr>
+                    <a:xfrm>
+                      <a:off x="0" y="0"/>
+                      <a:ext cx="1475999" cy="3199210"/>
+                    </a:xfrm>
+                    <a:prstGeom prst="rect"/>
+                  </pic:spPr>
+                </pic:pic>
+              </a:graphicData>
+            </a:graphic>
+          </wp:inline>
+        </w:drawing>
+      </w:r>
+    </w:p>
+    <w:p>
+      <w:pPr>
+        <w:spacing w:before="0" w:after="100" w:line="288" w:lineRule="auto"/>
         <w:jc w:val="center"/>
       </w:pPr>
       <w:r>
@@ -1881,10 +1920,10 @@
           <w:rFonts w:ascii="Times New Roman" w:hAnsi="Times New Roman" w:eastAsia="Times New Roman"/>
           <w:b w:val="0"/>
           <w:i/>
-          <w:color w:val="C00000"/>
+          <w:color w:val="000000"/>
           <w:sz w:val="22"/>
         </w:rPr>
-        <w:t>[CHỜ CHÈN ẢNH CHỤP GOOGLE DOCS THẬT: cần thấy nội dung chỉnh sửa, bình luận và Version history]</w:t>
+        <w:t>Hình 5.2. Lịch sử phiên bản thực tế trên Google Docs</w:t>
       </w:r>
     </w:p>
     <w:p>
@@ -1949,7 +1988,7 @@
         <w:drawing>
           <wp:inline xmlns:a="http://schemas.openxmlformats.org/drawingml/2006/main" xmlns:pic="http://schemas.openxmlformats.org/drawingml/2006/picture">
             <wp:extent cx="2592000" cy="3888000"/>
-            <wp:docPr id="13" name="Picture 13"/>
+            <wp:docPr id="14" name="Picture 14"/>
             <wp:cNvGraphicFramePr>
               <a:graphicFrameLocks noChangeAspect="1"/>
             </wp:cNvGraphicFramePr>
@@ -1961,7 +2000,7 @@
                     <pic:cNvPicPr/>
                   </pic:nvPicPr>
                   <pic:blipFill>
-                    <a:blip r:embed="rId20"/>
+                    <a:blip r:embed="rId21"/>
                     <a:stretch>
                       <a:fillRect/>
                     </a:stretch>
@@ -1993,7 +2032,7 @@
           <w:color w:val="000000"/>
           <w:sz w:val="22"/>
         </w:rPr>
-        <w:t>Hình 5.2. Infographic về lợi ích của công nghệ số trong học tập</w:t>
+        <w:t>Hình 5.3. Infographic về lợi ích của công nghệ số trong học tập</w:t>
       </w:r>
     </w:p>
     <w:p>
@@ -2106,7 +2145,7 @@
         <w:drawing>
           <wp:inline xmlns:a="http://schemas.openxmlformats.org/drawingml/2006/main" xmlns:pic="http://schemas.openxmlformats.org/drawingml/2006/picture">
             <wp:extent cx="5184000" cy="3729600"/>
-            <wp:docPr id="14" name="Picture 14"/>
+            <wp:docPr id="15" name="Picture 15"/>
             <wp:cNvGraphicFramePr>
               <a:graphicFrameLocks noChangeAspect="1"/>
             </wp:cNvGraphicFramePr>
@@ -2118,7 +2157,7 @@
                     <pic:cNvPicPr/>
                   </pic:nvPicPr>
                   <pic:blipFill>
-                    <a:blip r:embed="rId21"/>
+                    <a:blip r:embed="rId22"/>
                     <a:stretch>
                       <a:fillRect/>
                     </a:stretch>
@@ -2150,7 +2189,7 @@
           <w:color w:val="000000"/>
           <w:sz w:val="22"/>
         </w:rPr>
-        <w:t>Hình 5.3. Website giới thiệu và trưng bày sản phẩm Lab 05</w:t>
+        <w:t>Hình 5.4. Website giới thiệu và trưng bày sản phẩm Lab 05</w:t>
       </w:r>
     </w:p>
     <w:p>

</xml_diff>